<commit_message>
Record pending client Resend administrator handover
</commit_message>
<xml_diff>
--- a/docs/REViVE-Website-Guide.docx
+++ b/docs/REViVE-Website-Guide.docx
@@ -1682,7 +1682,7 @@
               <w:rPr>
                 <w:sz w:val="20"/>
               </w:rPr>
-              <w:t xml:space="preserve">Managed through the developer's </w:t>
+              <w:t xml:space="preserve">Admin invitation sent to ReviveCovington@gmail.com on October 29, 2026; awaiting acceptance. The developer still has access to the existing </w:t>
             </w:r>
             <w:r>
               <w:rPr>
@@ -1695,7 +1695,7 @@
               <w:rPr>
                 <w:sz w:val="20"/>
               </w:rPr>
-              <w:t xml:space="preserve"> team. Arrange suitable client access or a client-owned account before ending the maintenance arrangement.</w:t>
+              <w:t xml:space="preserve"> team.</w:t>
             </w:r>
           </w:p>
         </w:tc>
@@ -1895,6 +1895,14 @@
         <w:pStyle w:val="ListBullet"/>
       </w:pPr>
       <w:r>
+        <w:t>Accept the Resend invitation in the client's Gmail, sign in using that address, and confirm access before removing the developer from the team.</w:t>
+      </w:r>
+    </w:p>
+    <w:p>
+      <w:pPr>
+        <w:pStyle w:val="ListBullet"/>
+      </w:pPr>
+      <w:r>
         <w:t>Confirm the client can read a quote and reply to the customer.</w:t>
       </w:r>
     </w:p>
@@ -1903,7 +1911,7 @@
         <w:pStyle w:val="ListBullet"/>
       </w:pPr>
       <w:r>
-        <w:t>Arrange the Cloudflare, Resend, and search-tool access needed by the long-term maintainer.</w:t>
+        <w:t>Arrange the Cloudflare and search-tool access needed by the long-term maintainer.</w:t>
       </w:r>
     </w:p>
     <w:p>

</xml_diff>

<commit_message>
Record accepted client GitHub and Resend access
</commit_message>
<xml_diff>
--- a/docs/REViVE-Website-Guide.docx
+++ b/docs/REViVE-Website-Guide.docx
@@ -398,19 +398,7 @@
         <w:t>clayb1919</w:t>
       </w:r>
       <w:r>
-        <w:t xml:space="preserve"> was invited with write access to this repository on October 29, 2026. Accept the </w:t>
-      </w:r>
-      <w:hyperlink r:id="rId11">
-        <w:r>
-          <w:rPr>
-            <w:color w:val="175986"/>
-            <w:u w:val="single"/>
-          </w:rPr>
-          <w:t>repository invitation</w:t>
-        </w:r>
-      </w:hyperlink>
-      <w:r>
-        <w:t xml:space="preserve"> while signed into that account. This invitation does not give access to other repositories or to Cloudflare, Resend, or Gmail.</w:t>
+        <w:t xml:space="preserve"> has accepted write access to this repository, confirmed on October 29, 2026. Sign in with that account to edit the files. This access does not extend to other repositories or to Cloudflare, Resend, or Gmail.</w:t>
       </w:r>
     </w:p>
     <w:p>
@@ -1181,7 +1169,7 @@
       <w:r>
         <w:t xml:space="preserve">Open </w:t>
       </w:r>
-      <w:hyperlink r:id="rId12">
+      <w:hyperlink r:id="rId11">
         <w:r>
           <w:rPr>
             <w:color w:val="175986"/>
@@ -1600,7 +1588,7 @@
               <w:rPr>
                 <w:sz w:val="20"/>
               </w:rPr>
-              <w:t xml:space="preserve"> has a repository-only write invitation to accept.</w:t>
+              <w:t xml:space="preserve"> has accepted repository-only write access.</w:t>
             </w:r>
           </w:p>
         </w:tc>
@@ -1682,7 +1670,7 @@
               <w:rPr>
                 <w:sz w:val="20"/>
               </w:rPr>
-              <w:t xml:space="preserve">Admin invitation sent to ReviveCovington@gmail.com on October 29, 2026; awaiting acceptance. The developer still has access to the existing </w:t>
+              <w:t xml:space="preserve">ReviveCovington@gmail.com has accepted Admin access to the existing </w:t>
             </w:r>
             <w:r>
               <w:rPr>
@@ -1695,7 +1683,7 @@
               <w:rPr>
                 <w:sz w:val="20"/>
               </w:rPr>
-              <w:t xml:space="preserve"> team.</w:t>
+              <w:t xml:space="preserve"> team. The developer also remains an Admin; a separate team has not been created.</w:t>
             </w:r>
           </w:p>
         </w:tc>
@@ -1878,7 +1866,16 @@
         <w:pStyle w:val="ListBullet"/>
       </w:pPr>
       <w:r>
-        <w:t xml:space="preserve">Accept the GitHub invitation and open </w:t>
+        <w:t xml:space="preserve">Sign into GitHub as </w:t>
+      </w:r>
+      <w:r>
+        <w:rPr>
+          <w:b/>
+        </w:rPr>
+        <w:t>clayb1919</w:t>
+      </w:r>
+      <w:r>
+        <w:t xml:space="preserve"> and open </w:t>
       </w:r>
       <w:r>
         <w:rPr>
@@ -1895,7 +1892,7 @@
         <w:pStyle w:val="ListBullet"/>
       </w:pPr>
       <w:r>
-        <w:t>Accept the Resend invitation in the client's Gmail, sign in using that address, and confirm access before removing the developer from the team.</w:t>
+        <w:t>Decide whether to keep the existing Resend team and remove the developer after handover, or migrate to a separate team. Resend currently marks new-team creation as a paid feature; no paid plan has been purchased.</w:t>
       </w:r>
     </w:p>
     <w:p>
@@ -1921,7 +1918,7 @@
       <w:r>
         <w:t xml:space="preserve">Keep this guide updated when the setup changes. The </w:t>
       </w:r>
-      <w:hyperlink r:id="rId13">
+      <w:hyperlink r:id="rId12">
         <w:r>
           <w:rPr>
             <w:color w:val="175986"/>
@@ -1935,7 +1932,7 @@
       </w:r>
     </w:p>
     <w:sectPr>
-      <w:footerReference w:type="default" r:id="rId14"/>
+      <w:footerReference w:type="default" r:id="rId13"/>
       <w:pgSz w:w="12240" w:h="15840"/>
       <w:pgMar w:top="936" w:right="1008" w:bottom="936" w:left="1008" w:header="720" w:footer="360" w:gutter="0"/>
       <w:cols w:space="720"/>

</xml_diff>

<commit_message>
Document completed client Resend handover
</commit_message>
<xml_diff>
--- a/docs/REViVE-Website-Guide.docx
+++ b/docs/REViVE-Website-Guide.docx
@@ -1670,20 +1670,20 @@
               <w:rPr>
                 <w:sz w:val="20"/>
               </w:rPr>
-              <w:t xml:space="preserve">ReviveCovington@gmail.com has accepted Admin access to the existing </w:t>
+              <w:t xml:space="preserve">Client handover completed October 29, 2026. The team is named </w:t>
             </w:r>
             <w:r>
               <w:rPr>
-                <w:rFonts w:ascii="Courier New" w:hAnsi="Courier New"/>
+                <w:b/>
                 <w:sz w:val="20"/>
               </w:rPr>
-              <w:t>voric41</w:t>
+              <w:t>REViVE Phone Repair</w:t>
             </w:r>
             <w:r>
               <w:rPr>
                 <w:sz w:val="20"/>
               </w:rPr>
-              <w:t xml:space="preserve"> team. The developer also remains an Admin; a separate team has not been created.</w:t>
+              <w:t xml:space="preserve"> and ReviveCovington@gmail.com is its only member and Admin. The developer's membership was removed.</w:t>
             </w:r>
           </w:p>
         </w:tc>
@@ -1892,7 +1892,25 @@
         <w:pStyle w:val="ListBullet"/>
       </w:pPr>
       <w:r>
-        <w:t>Decide whether to keep the existing Resend team and remove the developer after handover, or migrate to a separate team. Resend currently marks new-team creation as a paid feature; no paid plan has been purchased.</w:t>
+        <w:t xml:space="preserve">Sign into Resend as </w:t>
+      </w:r>
+      <w:r>
+        <w:rPr>
+          <w:b/>
+        </w:rPr>
+        <w:t>ReviveCovington@gmail.com</w:t>
+      </w:r>
+      <w:r>
+        <w:t xml:space="preserve"> and select </w:t>
+      </w:r>
+      <w:r>
+        <w:rPr>
+          <w:b/>
+        </w:rPr>
+        <w:t>REViVE Phone Repair</w:t>
+      </w:r>
+      <w:r>
+        <w:t>. The existing free team has been handed over; its sending domain and website connection are unchanged. No paid plan was purchased.</w:t>
       </w:r>
     </w:p>
     <w:p>

</xml_diff>